<commit_message>
update cac file và EfficieentNetB4_vs4
</commit_message>
<xml_diff>
--- a/BaoCao/B2111908_LuanVan.docx
+++ b/BaoCao/B2111908_LuanVan.docx
@@ -10910,7 +10910,21 @@
           <w:sz w:val="26"/>
           <w:szCs w:val="26"/>
         </w:rPr>
-        <w:t xml:space="preserve">Mục tiêu chính của nghiên cứu trong bài viết này là giải quyết vấn đề phân loại cảm xúc khuôn mặt bằng cách nghiên cứu và áp dụng các mô hình học sâu tiên tiến để xây dựng giải pháp hiệu quả. Trong nghiên cứu này, các mô hình CNN như ResNet50, </w:t>
+        <w:t xml:space="preserve">Mục tiêu chính của nghiên cứu trong bài viết này là giải quyết vấn đề phân loại cảm xúc khuôn mặt bằng cách nghiên cứu và áp dụng các mô hình học sâu tiên tiến để xây dựng giải pháp hiệu quả. Trong nghiên cứu này, các mô hình </w:t>
+      </w:r>
+      <w:r>
+        <w:rPr>
+          <w:sz w:val="26"/>
+          <w:szCs w:val="26"/>
+        </w:rPr>
+        <w:t>deep learning</w:t>
+      </w:r>
+      <w:r>
+        <w:rPr>
+          <w:sz w:val="26"/>
+          <w:szCs w:val="26"/>
+        </w:rPr>
+        <w:t xml:space="preserve"> như ResNet50, </w:t>
       </w:r>
       <w:r>
         <w:rPr>
@@ -10924,7 +10938,7 @@
           <w:sz w:val="26"/>
           <w:szCs w:val="26"/>
         </w:rPr>
-        <w:t xml:space="preserve">, DenseNet121, DenseNet169, MobileNetV2, EfficientNetB0, EfficientNetB1, EfficientNetB2, EfficientNetB3, EfficientNetB4 và các mô hình Vision Transformer như ViT, Swin được sử dụng để phân loại cảm xúc trên ảnh </w:t>
+        <w:t xml:space="preserve">, DenseNet121, DenseNet169, MobileNetV2, EfficientNetB0, EfficientNetB1, EfficientNetB2, EfficientNetB3, EfficientNetB4 và các mô hình Vision Transformer như ViT, Swin được sử dụng để phân loại cảm xúc </w:t>
       </w:r>
       <w:r>
         <w:rPr>
@@ -10932,7 +10946,7 @@
           <w:szCs w:val="26"/>
         </w:rPr>
         <w:lastRenderedPageBreak/>
-        <w:t>khuôn mặt. Về mặt khoa học, luận văn này được phát triển dựa trên kết quả nghiên cứu được đề xuất trong bài báo “Facial Emotion Recognition Using Advanced CNN and Vision Transformer Models for Image Classification”.</w:t>
+        <w:t>trên ảnh khuôn mặt. Về mặt khoa học, luận văn này được phát triển dựa trên kết quả nghiên cứu được đề xuất trong bài báo “Facial Emotion Recognition Using Advanced CNN and Vision Transformer Models for Image Classification”.</w:t>
       </w:r>
     </w:p>
     <w:p>
@@ -11277,7 +11291,21 @@
           <w:sz w:val="26"/>
           <w:szCs w:val="26"/>
         </w:rPr>
-        <w:t xml:space="preserve">+ Sử dụng các mô hình CNN như ResNet50, </w:t>
+        <w:t xml:space="preserve">+ Sử dụng các mô hình </w:t>
+      </w:r>
+      <w:r>
+        <w:rPr>
+          <w:sz w:val="26"/>
+          <w:szCs w:val="26"/>
+        </w:rPr>
+        <w:t>deep learning</w:t>
+      </w:r>
+      <w:r>
+        <w:rPr>
+          <w:sz w:val="26"/>
+          <w:szCs w:val="26"/>
+        </w:rPr>
+        <w:t xml:space="preserve"> như ResNet50, </w:t>
       </w:r>
       <w:r>
         <w:rPr>
@@ -11381,7 +11409,21 @@
           <w:sz w:val="26"/>
           <w:szCs w:val="26"/>
         </w:rPr>
-        <w:t>+ So sánh hiệu suất giữa các mô hình CNN và Vision Transformer.</w:t>
+        <w:t xml:space="preserve">+ So sánh hiệu suất giữa các mô hình </w:t>
+      </w:r>
+      <w:r>
+        <w:rPr>
+          <w:sz w:val="26"/>
+          <w:szCs w:val="26"/>
+        </w:rPr>
+        <w:t>deep learning</w:t>
+      </w:r>
+      <w:r>
+        <w:rPr>
+          <w:sz w:val="26"/>
+          <w:szCs w:val="26"/>
+        </w:rPr>
+        <w:t xml:space="preserve"> và Vision Transformer.</w:t>
       </w:r>
     </w:p>
     <w:p>
@@ -12117,7 +12159,6 @@
           <w:sz w:val="26"/>
           <w:szCs w:val="26"/>
         </w:rPr>
-        <w:lastRenderedPageBreak/>
         <w:t>Các bài toán trong machine learning thường được chia thành hai loại chính: dự đoán (prediction) và phân loại (classification). Bài toán dự đoán liên quan đến việc ước lượng các giá trị số, chẳng hạn như dự đoán giá nhà dựa trên diện tích và vị trí, hoặc dự đoán giá xe dựa trên năm sản xuất và tình trạng sử dụng. Trong khi đó, bài toán phân loại tập trung vào việc gán nhãn cho dữ liệu, ví dụ như nhận diện chữ viết tay (phân biệt các chữ số từ 0 đến 9) hoặc nhận diện đồ vật trong hình ảnh (như phân biệt xe hơi và xe máy).</w:t>
       </w:r>
     </w:p>
@@ -12246,6 +12287,7 @@
           <w:sz w:val="26"/>
           <w:szCs w:val="26"/>
         </w:rPr>
+        <w:lastRenderedPageBreak/>
         <w:t>Cải thiện (Improve): Nếu mô hình không đạt kỳ vọng, cần quay lại bước huấn luyện để điều chỉnh tham số, thử nghiệm thuật toán mới hoặc bổ sung dữ liệu. Quá trình này có thể lặp lại nhiều lần cho đến khi đạt được hiệu suất mong muốn. Tổng thời gian cho ba bước cuối (huấn luyện, đánh giá, cải thiện) thường chiếm khoảng 30% tổng thời gian dự án, trong khi hai bước đầu tiên chiếm phần lớn thời gian còn lại</w:t>
       </w:r>
       <w:r>
@@ -36373,28 +36415,28 @@
 </file>
 
 <file path=customXml/item1.xml><?xml version="1.0" encoding="utf-8"?>
+<b:Sources xmlns:b="http://schemas.openxmlformats.org/officeDocument/2006/bibliography" xmlns="http://schemas.openxmlformats.org/officeDocument/2006/bibliography" SelectedStyle="\APASixthEditionOfficeOnline.xsl" StyleName="APA" Version="6"/>
+</file>
+
+<file path=customXml/item2.xml><?xml version="1.0" encoding="utf-8"?>
 <go:gDocsCustomXmlDataStorage xmlns:go="http://customooxmlschemas.google.com/" xmlns:r="http://schemas.openxmlformats.org/officeDocument/2006/relationships" uri="GoogleDocsCustomDataVersion2">
   <go:docsCustomData xmlns:go="http://customooxmlschemas.google.com/" roundtripDataSignature="AMtx7mirUMg8LuMSpLc0qa0cphsuGzfkEw==">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</go:docsCustomData>
 </go:gDocsCustomXmlDataStorage>
 </file>
 
-<file path=customXml/item2.xml><?xml version="1.0" encoding="utf-8"?>
-<b:Sources xmlns:b="http://schemas.openxmlformats.org/officeDocument/2006/bibliography" xmlns="http://schemas.openxmlformats.org/officeDocument/2006/bibliography" SelectedStyle="\APASixthEditionOfficeOnline.xsl" StyleName="APA" Version="6"/>
+<file path=customXml/itemProps1.xml><?xml version="1.0" encoding="utf-8"?>
+<ds:datastoreItem xmlns:ds="http://schemas.openxmlformats.org/officeDocument/2006/customXml" ds:itemID="{19C5C737-631B-49DE-B0F2-34A13868C5A8}">
+  <ds:schemaRefs>
+    <ds:schemaRef ds:uri="http://schemas.openxmlformats.org/officeDocument/2006/bibliography"/>
+  </ds:schemaRefs>
+</ds:datastoreItem>
 </file>
 
-<file path=customXml/itemProps1.xml><?xml version="1.0" encoding="utf-8"?>
+<file path=customXml/itemProps2.xml><?xml version="1.0" encoding="utf-8"?>
 <ds:datastoreItem xmlns:ds="http://schemas.openxmlformats.org/officeDocument/2006/customXml" ds:itemID="{11111111-1234-1234-1234-123412341234}">
   <ds:schemaRefs>
     <ds:schemaRef ds:uri="http://customooxmlschemas.google.com/"/>
     <ds:schemaRef ds:uri="http://schemas.openxmlformats.org/officeDocument/2006/relationships"/>
   </ds:schemaRefs>
 </ds:datastoreItem>
-</file>
-
-<file path=customXml/itemProps2.xml><?xml version="1.0" encoding="utf-8"?>
-<ds:datastoreItem xmlns:ds="http://schemas.openxmlformats.org/officeDocument/2006/customXml" ds:itemID="{19C5C737-631B-49DE-B0F2-34A13868C5A8}">
-  <ds:schemaRefs>
-    <ds:schemaRef ds:uri="http://schemas.openxmlformats.org/officeDocument/2006/bibliography"/>
-  </ds:schemaRefs>
-</ds:datastoreItem>
 </file>
</xml_diff>